<commit_message>
auto(daily): dev loop report 2026-06-17
</commit_message>
<xml_diff>
--- a/reports/hypothesis/2026-06-17.docx
+++ b/reports/hypothesis/2026-06-17.docx
@@ -15,7 +15,7 @@
         <w:rPr>
           <w:i/>
         </w:rPr>
-        <w:t>생성일: 2026-06-17 09:15 KST  |  표본: 측정소당 최소 2556건 / 총 12955건</w:t>
+        <w:t>생성일: 2026-06-17 14:14 KST  |  표본: 측정소당 최소 2561건 / 총 12980건</w:t>
       </w:r>
     </w:p>
     <w:p>
@@ -143,7 +143,7 @@
           </w:tcPr>
           <w:p>
             <w:r>
-              <w:t>36.187</w:t>
+              <w:t>36.154</w:t>
             </w:r>
           </w:p>
         </w:tc>
@@ -153,7 +153,7 @@
           </w:tcPr>
           <w:p>
             <w:r>
-              <w:t>33.163</w:t>
+              <w:t>33.125</w:t>
             </w:r>
           </w:p>
         </w:tc>
@@ -163,7 +163,7 @@
           </w:tcPr>
           <w:p>
             <w:r>
-              <w:t>+3.023</w:t>
+              <w:t>+3.028</w:t>
             </w:r>
           </w:p>
         </w:tc>
@@ -215,7 +215,7 @@
           </w:tcPr>
           <w:p>
             <w:r>
-              <w:t>20.294</w:t>
+              <w:t>20.275</w:t>
             </w:r>
           </w:p>
         </w:tc>
@@ -225,7 +225,7 @@
           </w:tcPr>
           <w:p>
             <w:r>
-              <w:t>17.474</w:t>
+              <w:t>17.457</w:t>
             </w:r>
           </w:p>
         </w:tc>
@@ -235,7 +235,7 @@
           </w:tcPr>
           <w:p>
             <w:r>
-              <w:t>+2.820</w:t>
+              <w:t>+2.818</w:t>
             </w:r>
           </w:p>
         </w:tc>
@@ -513,7 +513,7 @@
           </w:tcPr>
           <w:p>
             <w:r>
-              <w:t>0.476</w:t>
+              <w:t>0.475</w:t>
             </w:r>
           </w:p>
         </w:tc>
@@ -660,7 +660,7 @@
           </w:tcPr>
           <w:p>
             <w:r>
-              <w:t>32.02</w:t>
+              <w:t>31.95</w:t>
             </w:r>
           </w:p>
         </w:tc>
@@ -722,7 +722,7 @@
           </w:tcPr>
           <w:p>
             <w:r>
-              <w:t>82.99</w:t>
+              <w:t>82.93</w:t>
             </w:r>
           </w:p>
         </w:tc>
@@ -784,7 +784,7 @@
           </w:tcPr>
           <w:p>
             <w:r>
-              <w:t>13.51</w:t>
+              <w:t>13.61</w:t>
             </w:r>
           </w:p>
         </w:tc>
@@ -846,7 +846,7 @@
           </w:tcPr>
           <w:p>
             <w:r>
-              <w:t>163.43</w:t>
+              <w:t>163.18</w:t>
             </w:r>
           </w:p>
         </w:tc>
@@ -876,7 +876,7 @@
           </w:tcPr>
           <w:p>
             <w:r>
-              <w:t>0.050</w:t>
+              <w:t>0.049</w:t>
             </w:r>
           </w:p>
         </w:tc>
@@ -908,7 +908,7 @@
           </w:tcPr>
           <w:p>
             <w:r>
-              <w:t>64.45</w:t>
+              <w:t>64.44</w:t>
             </w:r>
           </w:p>
         </w:tc>
@@ -970,7 +970,7 @@
           </w:tcPr>
           <w:p>
             <w:r>
-              <w:t>151.31</w:t>
+              <w:t>151.97</w:t>
             </w:r>
           </w:p>
         </w:tc>

</xml_diff>